<commit_message>
fix(rirekisho): 退社, 現在に至る and 免許・資格 rows read as a Japanese reader expects
</commit_message>
<xml_diff>
--- a/templates/rirekisho.blank.docx
+++ b/templates/rirekisho.blank.docx
@@ -30,7 +30,7 @@
         <w:rPr>
           <w:lang w:val="en-US"/>
         </w:rPr>
-        <w:t xml:space="preserve">{submitYear}年 {submitMonth}月 {submitDay}日 </w:t>
+        <w:t xml:space="preserve">{submitYear}年 {submitMonth}月 {submitDay}日現在</w:t>
       </w:r>
     </w:p>
     <w:tbl>
@@ -677,7 +677,7 @@
           </w:tcPr>
           <w:p>
             <w:pPr>
-              <w:jc w:val="center"/>
+              <w:jc w:val="right"/>
             </w:pPr>
             <w:r>
               <w:rPr>

</xml_diff>

<commit_message>
fix(render): correct Japanese 履歴書 rows and formatting (#145)
* fix(rirekisho): 退社, 現在に至る and 免許・資格 rows read as a Japanese reader expects

* no-mistakes(review): fix: recognize 英検 and JLPT examination names

* no-mistakes(document): Clarify 履歴書 certification and timeline documentation
</commit_message>
<xml_diff>
--- a/templates/rirekisho.blank.docx
+++ b/templates/rirekisho.blank.docx
@@ -30,7 +30,7 @@
         <w:rPr>
           <w:lang w:val="en-US"/>
         </w:rPr>
-        <w:t xml:space="preserve">{submitYear}年 {submitMonth}月 {submitDay}日 </w:t>
+        <w:t xml:space="preserve">{submitYear}年 {submitMonth}月 {submitDay}日現在</w:t>
       </w:r>
     </w:p>
     <w:tbl>
@@ -677,7 +677,7 @@
           </w:tcPr>
           <w:p>
             <w:pPr>
-              <w:jc w:val="center"/>
+              <w:jc w:val="right"/>
             </w:pPr>
             <w:r>
               <w:rPr>

</xml_diff>